<commit_message>
docs: clarify event integration and public submission access
</commit_message>
<xml_diff>
--- a/docs/planning/Midterm_2026626007_김태준.docx
+++ b/docs/planning/Midterm_2026626007_김태준.docx
@@ -8334,7 +8334,7 @@
           <w:color w:val="000000"/>
           <w:sz w:val="18"/>
         </w:rPr>
-        <w:t>명조 공식 공지에는 임무 참여와 상점 교환의 마감이 다른 사례가 있고, 엔드필드에는 점검 전처럼 시각이 미확정인 일정도 있다[1][2]. 소녀전선 2는 공식 카페가 공지 채널로 안내되어 있다[3]. 세 게임 전체의 공개 일정 API 제공 여부와 수집 방식은 연동 전에 검증한다.</w:t>
+        <w:t>일정 수집과 개인 완료 확인은 별개다. 명조·소녀전선 2는 이용 서버의 공식 공지에서 기간을 검수한다[1][3]. 엔드필드 SKPORT는 일일·주간 진행 정보를 제공하지만 외부 앱용 API와 개별 이벤트 보상 수령 조회는 별도 검증이 필요하다[6]. 기말 버전은 참여·보상을 직접 체크한다.</w:t>
       </w:r>
     </w:p>
     <w:p>
@@ -9154,7 +9154,7 @@
           <w:color w:val="000000"/>
           <w:sz w:val="18"/>
         </w:rPr>
-        <w:t>구현 순서  검수된 JSON 수신과 Room 병합부터 구현하고, 대표 게임 한 개의 공식 공지 수집·추출을 추가 검증한다. 앱 실행 시 오래된 정보를 새로 확인하며 배경 갱신은 WorkManager를 사용한다. 배터리 상태 등에 따라 지연될 수 있으므로 실시간 갱신으로 보장하지 않는다[5].</w:t>
+        <w:t>구현 순서  검수한 일정 JSON 수신·병합 후 대표 게임 한 개의 공지 추출을 검증한다. 임무·교환 기간은 별도 일정, 반복 목표는 숙제로 등록한다. 게임 실행·앱 복귀만으로 완료 처리하지 않는다. 배경 일정 갱신은 WorkManager를 쓰되 실행이 지연될 수 있다[5]. 개인 진행 자동 연동은 후속 과제로 둔다.</w:t>
       </w:r>
     </w:p>
     <w:p>
@@ -9563,7 +9563,7 @@
           <w:color w:val="000000"/>
           <w:sz w:val="19"/>
         </w:rPr>
-        <w:t>GitHub 관리  game-homework-scheduler 비공개 저장소를 생성하고 첫 페이지에 실제 주소를 반영했다. README와 기획·설계 자료를 관리하며 제출 시 담당 교수의 접근 권한을 확인한다. 기능 단위로 커밋하고 최종 코드와 제출 APK의 버전을 일치시킨다.</w:t>
+        <w:t>GitHub 관리  game-homework-scheduler 저장소를 공개로 전환하고 첫 페이지에 실제 주소를 반영했다. README와 기획·설계 자료를 관리하며 로그인 없이 제출 자료를 열람할 수 있다. 기능 단위로 커밋하고 최종 코드와 제출 APK의 버전을 일치시킨다.</w:t>
       </w:r>
     </w:p>
     <w:p>
@@ -9708,7 +9708,7 @@
           <w:color w:val="000000"/>
           <w:sz w:val="19"/>
         </w:rPr>
-        <w:t>☑  학번·이름 및 실제 GitHub 저장소 주소 입력</w:t>
+        <w:t>☑  학번·이름 및 실제 GitHub 주소 입력, 저장소 공개 전환</w:t>
       </w:r>
     </w:p>
     <w:p>
@@ -9726,7 +9726,7 @@
           <w:color w:val="000000"/>
           <w:sz w:val="19"/>
         </w:rPr>
-        <w:t>☐  담당 교수의 저장소 접근 확인 및 수업 제출 시스템에 최종 제출</w:t>
+        <w:t>☐  수업 제출 시스템에 최종 PDF와 저장소 주소 제출</w:t>
       </w:r>
     </w:p>
     <w:p>
@@ -9908,6 +9908,24 @@
             <w:sz w:val="17"/>
           </w:rPr>
           <w:t>[5] Android Developers WorkManager 작업 정의</w:t>
+        </w:r>
+      </w:hyperlink>
+    </w:p>
+    <w:p>
+      <w:pPr>
+        <w:keepNext w:val="0"/>
+        <w:keepLines/>
+        <w:pageBreakBefore w:val="0"/>
+        <w:spacing w:before="0" w:after="20" w:line="238" w:lineRule="exact"/>
+        <w:snapToGrid w:val="0"/>
+      </w:pPr>
+      <w:hyperlink r:id="rId27">
+        <w:r>
+          <w:rPr>
+            <w:rFonts w:ascii="맑은 고딕" w:hAnsi="맑은 고딕" w:eastAsia="맑은 고딕"/>
+            <w:sz w:val="17"/>
+          </w:rPr>
+          <w:t>[6] 엔드필드 공식 게임 도구 업데이트 안내</w:t>
         </w:r>
       </w:hyperlink>
     </w:p>

</xml_diff>